<commit_message>
Aggiornamento valori nutrizionali (ora per 100g) e fix Documentazione Tecnica
</commit_message>
<xml_diff>
--- a/docs/FitApp - Documentazione Tecnica.docx
+++ b/docs/FitApp - Documentazione Tecnica.docx
@@ -6,7 +6,12 @@
       <w:sdtPr>
         <w:rPr>
           <w:rFonts w:asciiTheme="majorHAnsi" w:eastAsiaTheme="majorEastAsia" w:hAnsiTheme="majorHAnsi" w:cstheme="majorBidi"/>
+          <w:b/>
+          <w:bCs/>
           <w:caps/>
+          <w:color w:val="365F91" w:themeColor="accent1" w:themeShade="BF"/>
+          <w:sz w:val="28"/>
+          <w:szCs w:val="28"/>
         </w:rPr>
         <w:id w:val="4325954"/>
         <w:docPartObj>
@@ -16,12 +21,7 @@
       </w:sdtPr>
       <w:sdtEndPr>
         <w:rPr>
-          <w:b/>
-          <w:bCs/>
           <w:caps w:val="0"/>
-          <w:color w:val="365F91" w:themeColor="accent1" w:themeShade="BF"/>
-          <w:sz w:val="28"/>
-          <w:szCs w:val="28"/>
         </w:rPr>
       </w:sdtEndPr>
       <w:sdtContent>
@@ -2233,7 +2233,7 @@
             <o:lock v:ext="edit" aspectratio="t"/>
           </v:shapetype>
           <v:shape id="_x0000_i1026" type="#_x0000_t75" style="width:481.45pt;height:324.65pt">
-            <v:imagedata r:id="rId8" o:title="mermaid-diagram-2026-06-25-154156"/>
+            <v:imagedata r:id="rId8" o:title="mermaid-diagram-2026-07-16-152939"/>
           </v:shape>
         </w:pict>
       </w:r>
@@ -2304,8 +2304,8 @@
       </w:pPr>
       <w:r>
         <w:pict>
-          <v:shape id="_x0000_i1027" type="#_x0000_t75" style="width:481.05pt;height:455.4pt">
-            <v:imagedata r:id="rId9" o:title="mermaid-diagram-2026-06-24-145338"/>
+          <v:shape id="_x0000_i1027" type="#_x0000_t75" style="width:481.05pt;height:471.75pt">
+            <v:imagedata r:id="rId9" o:title="mermaid-diagram-2026-07-16-155558"/>
           </v:shape>
         </w:pict>
       </w:r>
@@ -2584,7 +2584,7 @@
             <w:rPr>
               <w:noProof/>
             </w:rPr>
-            <w:t>2</w:t>
+            <w:t>6</w:t>
           </w:r>
         </w:fldSimple>
       </w:p>
@@ -4195,36 +4195,6 @@
         </w:p>
       </w:docPartBody>
     </w:docPart>
-    <w:docPart>
-      <w:docPartPr>
-        <w:name w:val="9B0CBCCE70EC4D33BC3B1564CD33E9EE"/>
-        <w:category>
-          <w:name w:val="Generale"/>
-          <w:gallery w:val="placeholder"/>
-        </w:category>
-        <w:types>
-          <w:type w:val="bbPlcHdr"/>
-        </w:types>
-        <w:behaviors>
-          <w:behavior w:val="content"/>
-        </w:behaviors>
-        <w:guid w:val="{2863A208-DF12-4FCA-BF91-8F9ABC9BE19C}"/>
-      </w:docPartPr>
-      <w:docPartBody>
-        <w:p>
-          <w:pPr>
-            <w:pStyle w:val="9B0CBCCE70EC4D33BC3B1564CD33E9EE"/>
-          </w:pPr>
-          <w:r>
-            <w:rPr>
-              <w:b/>
-              <w:bCs/>
-            </w:rPr>
-            <w:t>[Digitare il nome dell'autore]</w:t>
-          </w:r>
-        </w:p>
-      </w:docPartBody>
-    </w:docPart>
   </w:docParts>
 </w:glossaryDocument>
 </file>
@@ -4277,8 +4247,9 @@
     <w:panose1 w:val="020B0604030504040204"/>
     <w:charset w:val="00"/>
     <w:family w:val="swiss"/>
+    <w:notTrueType/>
     <w:pitch w:val="variable"/>
-    <w:sig w:usb0="E1002EFF" w:usb1="C000605B" w:usb2="00000029" w:usb3="00000000" w:csb0="000101FF" w:csb1="00000000"/>
+    <w:sig w:usb0="00000003" w:usb1="00000000" w:usb2="00000000" w:usb3="00000000" w:csb0="00000001" w:csb1="00000000"/>
   </w:font>
 </w:fonts>
 </file>
@@ -4297,6 +4268,7 @@
     <w:rsid w:val="008539FA"/>
     <w:rsid w:val="00BD73FB"/>
     <w:rsid w:val="00C024D5"/>
+    <w:rsid w:val="00C3755C"/>
   </w:rsids>
   <m:mathPr>
     <m:mathFont m:val="Cambria Math"/>
@@ -4876,7 +4848,7 @@
 </file>
 
 <file path=customXml/itemProps1.xml><?xml version="1.0" encoding="utf-8"?>
-<ds:datastoreItem xmlns:ds="http://schemas.openxmlformats.org/officeDocument/2006/customXml" ds:itemID="{F220ED1A-B42A-4680-B154-BC3316A45AA8}">
+<ds:datastoreItem xmlns:ds="http://schemas.openxmlformats.org/officeDocument/2006/customXml" ds:itemID="{83738A16-60CB-418B-9042-37EF0E2FBB05}">
   <ds:schemaRefs>
     <ds:schemaRef ds:uri="http://schemas.openxmlformats.org/officeDocument/2006/bibliography"/>
   </ds:schemaRefs>

</xml_diff>